<commit_message>
update modules doc with samples
</commit_message>
<xml_diff>
--- a/MECH191_metallurgy/semesterActivity/MECH191_Modules.docx
+++ b/MECH191_metallurgy/semesterActivity/MECH191_Modules.docx
@@ -28452,7 +28452,7 @@
                 <w:color w:val="444444"/>
                 <w:sz w:val="18"/>
               </w:rPr>
-              <w:t>Welding process fundamentals are covered in this week's lecture material; this module's hands-on specimen instead examines how zinc content changes brass microstructure across three grades. Specimen K (cartridge brass, 70/30 Cu-Zn) is single-phase alpha. Specimen L (free-machining brass) adds a small lead addition for machinability. Specimen M (naval brass) crosses into a two-phase alpha-beta structure at higher zinc content. Together they show a single compositional variable — zinc — driving a real change in phase count, not just grain size.</w:t>
+              <w:t>Welding process fundamentals are covered in this week's lecture material; this module's hands-on specimen instead examines how zinc content changes brass microstructure across three grades. Specimens K (cartridge brass, 70/30 Cu-Zn, revisit from Module 5) and L (free-machining brass, revisit from Module 7) return for a direct side-by-side comparison, joined by Specimen M (naval brass), seen here for the first time. K is single-phase alpha; L adds a small lead addition for machinability; M crosses into a two-phase alpha-beta structure at higher zinc content. Together they show a single compositional variable — zinc — driving a real change in phase count, not just grain size.</w:t>
             </w:r>
           </w:p>
         </w:tc>
@@ -28550,7 +28550,7 @@
                 <w:color w:val="000000"/>
                 <w:sz w:val="18"/>
               </w:rPr>
-              <w:t xml:space="preserve">K – 260 brass (cartridge, single-phase alpha) </w:t>
+              <w:t>K – 260 brass (cartridge, single-phase alpha) (revisit, Module 5)</w:t>
             </w:r>
             <w:r>
               <w:br/>
@@ -28562,7 +28562,7 @@
                 <w:color w:val="000000"/>
                 <w:sz w:val="18"/>
               </w:rPr>
-              <w:t xml:space="preserve">L – 360 brass (leaded, free-machining) </w:t>
+              <w:t>L – 360 brass (leaded, free-machining) (revisit, Module 7)</w:t>
             </w:r>
             <w:r>
               <w:br/>

</xml_diff>

<commit_message>
fix overflow in modules
</commit_message>
<xml_diff>
--- a/MECH191_metallurgy/semesterActivity/MECH191_Modules.docx
+++ b/MECH191_metallurgy/semesterActivity/MECH191_Modules.docx
@@ -1409,8 +1409,8 @@
       </w:tblPr>
       <w:tblGrid>
         <w:gridCol w:w="2268"/>
-        <w:gridCol w:w="1445"/>
-        <w:gridCol w:w="5641"/>
+        <w:gridCol w:w="1444"/>
+        <w:gridCol w:w="5642"/>
       </w:tblGrid>
       <w:tr>
         <w:trPr>
@@ -1448,7 +1448,7 @@
         </w:tc>
         <w:tc>
           <w:tcPr>
-            <w:tcW w:w="1445" w:type="dxa"/>
+            <w:tcW w:w="1444" w:type="dxa"/>
             <w:tcBorders>
               <w:top w:val="single" w:sz="4" w:space="0" w:color="000000"/>
               <w:start w:val="single" w:sz="4" w:space="0" w:color="000000"/>
@@ -1478,7 +1478,7 @@
         </w:tc>
         <w:tc>
           <w:tcPr>
-            <w:tcW w:w="5641" w:type="dxa"/>
+            <w:tcW w:w="5642" w:type="dxa"/>
             <w:tcBorders>
               <w:top w:val="single" w:sz="4" w:space="0" w:color="000000"/>
               <w:start w:val="single" w:sz="4" w:space="0" w:color="000000"/>
@@ -1539,7 +1539,7 @@
         </w:tc>
         <w:tc>
           <w:tcPr>
-            <w:tcW w:w="1445" w:type="dxa"/>
+            <w:tcW w:w="1444" w:type="dxa"/>
             <w:tcBorders>
               <w:top w:val="single" w:sz="4" w:space="0" w:color="000000"/>
               <w:start w:val="single" w:sz="4" w:space="0" w:color="000000"/>
@@ -1560,13 +1560,19 @@
               </w:rPr>
             </w:pPr>
             <w:r>
-              <w:rPr/>
+              <w:rPr>
+                <w:rFonts w:eastAsia="Calibri" w:cs="Calibri"/>
+                <w:b w:val="false"/>
+                <w:bCs w:val="false"/>
+                <w:sz w:val="21"/>
+                <w:szCs w:val="21"/>
+              </w:rPr>
             </w:r>
           </w:p>
         </w:tc>
         <w:tc>
           <w:tcPr>
-            <w:tcW w:w="5641" w:type="dxa"/>
+            <w:tcW w:w="5642" w:type="dxa"/>
             <w:vMerge w:val="restart"/>
             <w:tcBorders>
               <w:top w:val="single" w:sz="4" w:space="0" w:color="000000"/>
@@ -1742,7 +1748,7 @@
         </w:tc>
         <w:tc>
           <w:tcPr>
-            <w:tcW w:w="1445" w:type="dxa"/>
+            <w:tcW w:w="1444" w:type="dxa"/>
             <w:tcBorders>
               <w:top w:val="single" w:sz="4" w:space="0" w:color="000000"/>
               <w:start w:val="single" w:sz="4" w:space="0" w:color="000000"/>
@@ -1763,13 +1769,19 @@
               </w:rPr>
             </w:pPr>
             <w:r>
-              <w:rPr/>
+              <w:rPr>
+                <w:rFonts w:eastAsia="Calibri" w:cs="Calibri"/>
+                <w:b w:val="false"/>
+                <w:bCs w:val="false"/>
+                <w:sz w:val="21"/>
+                <w:szCs w:val="21"/>
+              </w:rPr>
             </w:r>
           </w:p>
         </w:tc>
         <w:tc>
           <w:tcPr>
-            <w:tcW w:w="5641" w:type="dxa"/>
+            <w:tcW w:w="5642" w:type="dxa"/>
             <w:vMerge w:val="continue"/>
             <w:tcBorders>
               <w:top w:val="single" w:sz="4" w:space="0" w:color="000000"/>
@@ -1822,7 +1834,7 @@
         </w:tc>
         <w:tc>
           <w:tcPr>
-            <w:tcW w:w="1445" w:type="dxa"/>
+            <w:tcW w:w="1444" w:type="dxa"/>
             <w:tcBorders>
               <w:top w:val="single" w:sz="4" w:space="0" w:color="000000"/>
               <w:start w:val="single" w:sz="4" w:space="0" w:color="000000"/>
@@ -1843,13 +1855,19 @@
               </w:rPr>
             </w:pPr>
             <w:r>
-              <w:rPr/>
+              <w:rPr>
+                <w:rFonts w:eastAsia="Calibri" w:cs="Calibri"/>
+                <w:b w:val="false"/>
+                <w:bCs w:val="false"/>
+                <w:sz w:val="21"/>
+                <w:szCs w:val="21"/>
+              </w:rPr>
             </w:r>
           </w:p>
         </w:tc>
         <w:tc>
           <w:tcPr>
-            <w:tcW w:w="5641" w:type="dxa"/>
+            <w:tcW w:w="5642" w:type="dxa"/>
             <w:vMerge w:val="continue"/>
             <w:tcBorders>
               <w:top w:val="single" w:sz="4" w:space="0" w:color="000000"/>
@@ -1902,7 +1920,7 @@
         </w:tc>
         <w:tc>
           <w:tcPr>
-            <w:tcW w:w="1445" w:type="dxa"/>
+            <w:tcW w:w="1444" w:type="dxa"/>
             <w:tcBorders>
               <w:top w:val="single" w:sz="4" w:space="0" w:color="000000"/>
               <w:start w:val="single" w:sz="4" w:space="0" w:color="000000"/>
@@ -1923,13 +1941,19 @@
               </w:rPr>
             </w:pPr>
             <w:r>
-              <w:rPr/>
+              <w:rPr>
+                <w:rFonts w:eastAsia="Calibri" w:cs="Calibri"/>
+                <w:b w:val="false"/>
+                <w:bCs w:val="false"/>
+                <w:sz w:val="21"/>
+                <w:szCs w:val="21"/>
+              </w:rPr>
             </w:r>
           </w:p>
         </w:tc>
         <w:tc>
           <w:tcPr>
-            <w:tcW w:w="5641" w:type="dxa"/>
+            <w:tcW w:w="5642" w:type="dxa"/>
             <w:vMerge w:val="continue"/>
             <w:tcBorders>
               <w:top w:val="single" w:sz="4" w:space="0" w:color="000000"/>
@@ -1982,7 +2006,7 @@
         </w:tc>
         <w:tc>
           <w:tcPr>
-            <w:tcW w:w="1445" w:type="dxa"/>
+            <w:tcW w:w="1444" w:type="dxa"/>
             <w:tcBorders>
               <w:top w:val="single" w:sz="4" w:space="0" w:color="000000"/>
               <w:start w:val="single" w:sz="4" w:space="0" w:color="000000"/>
@@ -2003,13 +2027,19 @@
               </w:rPr>
             </w:pPr>
             <w:r>
-              <w:rPr/>
+              <w:rPr>
+                <w:rFonts w:eastAsia="Calibri" w:cs="Calibri"/>
+                <w:b w:val="false"/>
+                <w:bCs w:val="false"/>
+                <w:sz w:val="21"/>
+                <w:szCs w:val="21"/>
+              </w:rPr>
             </w:r>
           </w:p>
         </w:tc>
         <w:tc>
           <w:tcPr>
-            <w:tcW w:w="5641" w:type="dxa"/>
+            <w:tcW w:w="5642" w:type="dxa"/>
             <w:vMerge w:val="continue"/>
             <w:tcBorders>
               <w:top w:val="single" w:sz="4" w:space="0" w:color="000000"/>
@@ -2062,7 +2092,7 @@
         </w:tc>
         <w:tc>
           <w:tcPr>
-            <w:tcW w:w="1445" w:type="dxa"/>
+            <w:tcW w:w="1444" w:type="dxa"/>
             <w:tcBorders>
               <w:top w:val="single" w:sz="4" w:space="0" w:color="000000"/>
               <w:start w:val="single" w:sz="4" w:space="0" w:color="000000"/>
@@ -2083,13 +2113,19 @@
               </w:rPr>
             </w:pPr>
             <w:r>
-              <w:rPr/>
+              <w:rPr>
+                <w:rFonts w:eastAsia="Calibri" w:cs="Calibri"/>
+                <w:b w:val="false"/>
+                <w:bCs w:val="false"/>
+                <w:sz w:val="21"/>
+                <w:szCs w:val="21"/>
+              </w:rPr>
             </w:r>
           </w:p>
         </w:tc>
         <w:tc>
           <w:tcPr>
-            <w:tcW w:w="5641" w:type="dxa"/>
+            <w:tcW w:w="5642" w:type="dxa"/>
             <w:vMerge w:val="continue"/>
             <w:tcBorders>
               <w:top w:val="single" w:sz="4" w:space="0" w:color="000000"/>
@@ -16999,7 +17035,7 @@
           <w:sz w:val="21"/>
           <w:szCs w:val="21"/>
         </w:rPr>
-        <w:t>Vickers indent pre-applied to all three mounts (same technique as Module 6) — no additional equipment needed</w:t>
+        <w:t>Vickers indent pre-applied to all three mounts (same technique as Module 6)</w:t>
       </w:r>
     </w:p>
     <w:p>
@@ -24644,8 +24680,8 @@
       <w:u w:val="single"/>
     </w:rPr>
   </w:style>
-  <w:style w:type="character" w:styleId="FootnoteCharactersuser">
-    <w:name w:val="Footnote Characters (user)"/>
+  <w:style w:type="character" w:styleId="FootnoteCharacters">
+    <w:name w:val="Footnote Characters"/>
     <w:uiPriority w:val="99"/>
     <w:semiHidden/>
     <w:unhideWhenUsed/>
@@ -24654,8 +24690,8 @@
       <w:vertAlign w:val="superscript"/>
     </w:rPr>
   </w:style>
-  <w:style w:type="character" w:styleId="FootnoteCharacters">
-    <w:name w:val="Footnote Characters"/>
+  <w:style w:type="character" w:styleId="FootnoteCharactersuser">
+    <w:name w:val="Footnote Characters (user)"/>
     <w:qFormat/>
     <w:rPr>
       <w:vertAlign w:val="superscript"/>
@@ -24679,8 +24715,8 @@
       <w:szCs w:val="20"/>
     </w:rPr>
   </w:style>
-  <w:style w:type="character" w:styleId="EndnoteCharactersuser">
-    <w:name w:val="Endnote Characters (user)"/>
+  <w:style w:type="character" w:styleId="EndnoteCharacters">
+    <w:name w:val="Endnote Characters"/>
     <w:uiPriority w:val="99"/>
     <w:semiHidden/>
     <w:unhideWhenUsed/>
@@ -24689,8 +24725,8 @@
       <w:vertAlign w:val="superscript"/>
     </w:rPr>
   </w:style>
-  <w:style w:type="character" w:styleId="EndnoteCharacters">
-    <w:name w:val="Endnote Characters"/>
+  <w:style w:type="character" w:styleId="EndnoteCharactersuser">
+    <w:name w:val="Endnote Characters (user)"/>
     <w:qFormat/>
     <w:rPr>
       <w:vertAlign w:val="superscript"/>

</xml_diff>

<commit_message>
updating safety passing grade
</commit_message>
<xml_diff>
--- a/MECH191_metallurgy/semesterActivity/MECH191_Modules.docx
+++ b/MECH191_metallurgy/semesterActivity/MECH191_Modules.docx
@@ -393,7 +393,67 @@
           <w:sz w:val="21"/>
           <w:szCs w:val="21"/>
         </w:rPr>
-        <w:t>Complete this quiz before beginning Module 1 hands-on lab work. Use the Etchant Safety Data Sheets, PPE Reference Guide, and EXAMET-5 Microscope &amp; Etchant Reference pages to answer if needed — this is a comprehension check, not a memory test. Passing score: 80% (15 of 18 correct) at instructor discretion.</w:t>
+        <w:t xml:space="preserve">Complete this quiz before beginning Module 1 hands-on lab work. Use the Etchant Safety Data Sheets, PPE Reference Guide, and EXAMET-5 Microscope &amp; Etchant Reference pages to answer if needed — this is a comprehension check, not a memory test. Passing score: </w:t>
+      </w:r>
+      <w:r>
+        <w:rPr>
+          <w:rFonts w:eastAsia="Calibri" w:cs="Calibri"/>
+          <w:b w:val="false"/>
+          <w:bCs w:val="false"/>
+          <w:i/>
+          <w:iCs/>
+          <w:sz w:val="21"/>
+          <w:szCs w:val="21"/>
+        </w:rPr>
+        <w:t>1</w:t>
+      </w:r>
+      <w:r>
+        <w:rPr>
+          <w:rFonts w:eastAsia="Calibri" w:cs="Calibri"/>
+          <w:b w:val="false"/>
+          <w:bCs w:val="false"/>
+          <w:i/>
+          <w:iCs/>
+          <w:sz w:val="21"/>
+          <w:szCs w:val="21"/>
+        </w:rPr>
+        <w:t>0</w:t>
+      </w:r>
+      <w:r>
+        <w:rPr>
+          <w:rFonts w:eastAsia="Calibri" w:cs="Calibri"/>
+          <w:b w:val="false"/>
+          <w:bCs w:val="false"/>
+          <w:i/>
+          <w:iCs/>
+          <w:sz w:val="21"/>
+          <w:szCs w:val="21"/>
+        </w:rPr>
+        <w:t>0% (1</w:t>
+      </w:r>
+      <w:r>
+        <w:rPr>
+          <w:rFonts w:eastAsia="Calibri" w:cs="Calibri"/>
+          <w:b w:val="false"/>
+          <w:bCs w:val="false"/>
+          <w:i/>
+          <w:iCs/>
+          <w:sz w:val="21"/>
+          <w:szCs w:val="21"/>
+        </w:rPr>
+        <w:t>8</w:t>
+      </w:r>
+      <w:r>
+        <w:rPr>
+          <w:rFonts w:eastAsia="Calibri" w:cs="Calibri"/>
+          <w:b w:val="false"/>
+          <w:bCs w:val="false"/>
+          <w:i/>
+          <w:iCs/>
+          <w:sz w:val="21"/>
+          <w:szCs w:val="21"/>
+        </w:rPr>
+        <w:t xml:space="preserve"> of 18 correct) at instructor discretion.</w:t>
       </w:r>
     </w:p>
     <w:p>
@@ -1409,8 +1469,8 @@
       </w:tblPr>
       <w:tblGrid>
         <w:gridCol w:w="2268"/>
-        <w:gridCol w:w="1444"/>
-        <w:gridCol w:w="5642"/>
+        <w:gridCol w:w="1443"/>
+        <w:gridCol w:w="5643"/>
       </w:tblGrid>
       <w:tr>
         <w:trPr>
@@ -1448,7 +1508,7 @@
         </w:tc>
         <w:tc>
           <w:tcPr>
-            <w:tcW w:w="1444" w:type="dxa"/>
+            <w:tcW w:w="1443" w:type="dxa"/>
             <w:tcBorders>
               <w:top w:val="single" w:sz="4" w:space="0" w:color="000000"/>
               <w:start w:val="single" w:sz="4" w:space="0" w:color="000000"/>
@@ -1478,7 +1538,7 @@
         </w:tc>
         <w:tc>
           <w:tcPr>
-            <w:tcW w:w="5642" w:type="dxa"/>
+            <w:tcW w:w="5643" w:type="dxa"/>
             <w:tcBorders>
               <w:top w:val="single" w:sz="4" w:space="0" w:color="000000"/>
               <w:start w:val="single" w:sz="4" w:space="0" w:color="000000"/>
@@ -1539,7 +1599,7 @@
         </w:tc>
         <w:tc>
           <w:tcPr>
-            <w:tcW w:w="1444" w:type="dxa"/>
+            <w:tcW w:w="1443" w:type="dxa"/>
             <w:tcBorders>
               <w:top w:val="single" w:sz="4" w:space="0" w:color="000000"/>
               <w:start w:val="single" w:sz="4" w:space="0" w:color="000000"/>
@@ -1572,7 +1632,7 @@
         </w:tc>
         <w:tc>
           <w:tcPr>
-            <w:tcW w:w="5642" w:type="dxa"/>
+            <w:tcW w:w="5643" w:type="dxa"/>
             <w:vMerge w:val="restart"/>
             <w:tcBorders>
               <w:top w:val="single" w:sz="4" w:space="0" w:color="000000"/>
@@ -1748,7 +1808,7 @@
         </w:tc>
         <w:tc>
           <w:tcPr>
-            <w:tcW w:w="1444" w:type="dxa"/>
+            <w:tcW w:w="1443" w:type="dxa"/>
             <w:tcBorders>
               <w:top w:val="single" w:sz="4" w:space="0" w:color="000000"/>
               <w:start w:val="single" w:sz="4" w:space="0" w:color="000000"/>
@@ -1781,7 +1841,7 @@
         </w:tc>
         <w:tc>
           <w:tcPr>
-            <w:tcW w:w="5642" w:type="dxa"/>
+            <w:tcW w:w="5643" w:type="dxa"/>
             <w:vMerge w:val="continue"/>
             <w:tcBorders>
               <w:top w:val="single" w:sz="4" w:space="0" w:color="000000"/>
@@ -1834,7 +1894,7 @@
         </w:tc>
         <w:tc>
           <w:tcPr>
-            <w:tcW w:w="1444" w:type="dxa"/>
+            <w:tcW w:w="1443" w:type="dxa"/>
             <w:tcBorders>
               <w:top w:val="single" w:sz="4" w:space="0" w:color="000000"/>
               <w:start w:val="single" w:sz="4" w:space="0" w:color="000000"/>
@@ -1867,7 +1927,7 @@
         </w:tc>
         <w:tc>
           <w:tcPr>
-            <w:tcW w:w="5642" w:type="dxa"/>
+            <w:tcW w:w="5643" w:type="dxa"/>
             <w:vMerge w:val="continue"/>
             <w:tcBorders>
               <w:top w:val="single" w:sz="4" w:space="0" w:color="000000"/>
@@ -1920,7 +1980,7 @@
         </w:tc>
         <w:tc>
           <w:tcPr>
-            <w:tcW w:w="1444" w:type="dxa"/>
+            <w:tcW w:w="1443" w:type="dxa"/>
             <w:tcBorders>
               <w:top w:val="single" w:sz="4" w:space="0" w:color="000000"/>
               <w:start w:val="single" w:sz="4" w:space="0" w:color="000000"/>
@@ -1953,7 +2013,7 @@
         </w:tc>
         <w:tc>
           <w:tcPr>
-            <w:tcW w:w="5642" w:type="dxa"/>
+            <w:tcW w:w="5643" w:type="dxa"/>
             <w:vMerge w:val="continue"/>
             <w:tcBorders>
               <w:top w:val="single" w:sz="4" w:space="0" w:color="000000"/>
@@ -2006,7 +2066,7 @@
         </w:tc>
         <w:tc>
           <w:tcPr>
-            <w:tcW w:w="1444" w:type="dxa"/>
+            <w:tcW w:w="1443" w:type="dxa"/>
             <w:tcBorders>
               <w:top w:val="single" w:sz="4" w:space="0" w:color="000000"/>
               <w:start w:val="single" w:sz="4" w:space="0" w:color="000000"/>
@@ -2039,7 +2099,7 @@
         </w:tc>
         <w:tc>
           <w:tcPr>
-            <w:tcW w:w="5642" w:type="dxa"/>
+            <w:tcW w:w="5643" w:type="dxa"/>
             <w:vMerge w:val="continue"/>
             <w:tcBorders>
               <w:top w:val="single" w:sz="4" w:space="0" w:color="000000"/>
@@ -2092,7 +2152,7 @@
         </w:tc>
         <w:tc>
           <w:tcPr>
-            <w:tcW w:w="1444" w:type="dxa"/>
+            <w:tcW w:w="1443" w:type="dxa"/>
             <w:tcBorders>
               <w:top w:val="single" w:sz="4" w:space="0" w:color="000000"/>
               <w:start w:val="single" w:sz="4" w:space="0" w:color="000000"/>
@@ -2125,7 +2185,7 @@
         </w:tc>
         <w:tc>
           <w:tcPr>
-            <w:tcW w:w="5642" w:type="dxa"/>
+            <w:tcW w:w="5643" w:type="dxa"/>
             <w:vMerge w:val="continue"/>
             <w:tcBorders>
               <w:top w:val="single" w:sz="4" w:space="0" w:color="000000"/>
@@ -24680,8 +24740,8 @@
       <w:u w:val="single"/>
     </w:rPr>
   </w:style>
-  <w:style w:type="character" w:styleId="FootnoteCharacters">
-    <w:name w:val="Footnote Characters"/>
+  <w:style w:type="character" w:styleId="FootnoteCharactersuser">
+    <w:name w:val="Footnote Characters (user)"/>
     <w:uiPriority w:val="99"/>
     <w:semiHidden/>
     <w:unhideWhenUsed/>
@@ -24690,8 +24750,8 @@
       <w:vertAlign w:val="superscript"/>
     </w:rPr>
   </w:style>
-  <w:style w:type="character" w:styleId="FootnoteCharactersuser">
-    <w:name w:val="Footnote Characters (user)"/>
+  <w:style w:type="character" w:styleId="FootnoteCharacters">
+    <w:name w:val="Footnote Characters"/>
     <w:qFormat/>
     <w:rPr>
       <w:vertAlign w:val="superscript"/>
@@ -24715,8 +24775,8 @@
       <w:szCs w:val="20"/>
     </w:rPr>
   </w:style>
-  <w:style w:type="character" w:styleId="EndnoteCharacters">
-    <w:name w:val="Endnote Characters"/>
+  <w:style w:type="character" w:styleId="EndnoteCharactersuser">
+    <w:name w:val="Endnote Characters (user)"/>
     <w:uiPriority w:val="99"/>
     <w:semiHidden/>
     <w:unhideWhenUsed/>
@@ -24725,8 +24785,8 @@
       <w:vertAlign w:val="superscript"/>
     </w:rPr>
   </w:style>
-  <w:style w:type="character" w:styleId="EndnoteCharactersuser">
-    <w:name w:val="Endnote Characters (user)"/>
+  <w:style w:type="character" w:styleId="EndnoteCharacters">
+    <w:name w:val="Endnote Characters"/>
     <w:qFormat/>
     <w:rPr>
       <w:vertAlign w:val="superscript"/>

</xml_diff>